<commit_message>
Document generation fixes, cleanup
</commit_message>
<xml_diff>
--- a/resume/resume_template.docx
+++ b/resume/resume_template.docx
@@ -188,23 +188,6 @@
         </w:rPr>
         <w:t>%%WORK_EXPERIENCE%%</w:t>
       </w:r>
-    </w:p>
-    <w:p>
-      <w:pPr>
-        <w:pStyle w:val="List Bullet"/>
-        <w:tabs>
-          <w:tab w:val="clear" w:pos="360"/>
-        </w:tabs>
-      </w:pPr>
-    </w:p>
-    <w:p>
-      <w:pPr>
-        <w:pStyle w:val="List Bullet"/>
-        <w:numPr>
-          <w:ilvl w:val="0"/>
-          <w:numId w:val="2"/>
-        </w:numPr>
-      </w:pPr>
     </w:p>
     <w:p>
       <w:pPr>

</xml_diff>